<commit_message>
[dyad] Salvar mapeamento DOCX falhando — fallback local implementado - wrote 1 file(s) + extra files edited outside of Dyad
</commit_message>
<xml_diff>
--- a/public/Solicitação de vistoria.docx
+++ b/public/Solicitação de vistoria.docx
@@ -267,18 +267,236 @@
         </w:rPr>
         <w:t>{{</w:t>
       </w:r>
-      <w:proofErr w:type="spellStart"/>
-      <w:r>
-        <w:rPr>
-          <w:rFonts w:ascii="Raleway" w:eastAsia="Raleway" w:hAnsi="Raleway" w:cs="Raleway"/>
-          <w:b/>
-          <w:bCs/>
-          <w:sz w:val="24"/>
-          <w:szCs w:val="24"/>
-        </w:rPr>
-        <w:t>endereco</w:t>
-      </w:r>
-      <w:proofErr w:type="spellEnd"/>
+      <w:r>
+        <w:rPr>
+          <w:rFonts w:ascii="Raleway" w:eastAsia="Raleway" w:hAnsi="Raleway" w:cs="Raleway"/>
+          <w:b/>
+          <w:bCs/>
+          <w:sz w:val="24"/>
+          <w:szCs w:val="24"/>
+        </w:rPr>
+        <w:t>Rua</w:t>
+      </w:r>
+      <w:r>
+        <w:rPr>
+          <w:rFonts w:ascii="Raleway" w:eastAsia="Raleway" w:hAnsi="Raleway" w:cs="Raleway"/>
+          <w:b/>
+          <w:bCs/>
+          <w:sz w:val="24"/>
+          <w:szCs w:val="24"/>
+        </w:rPr>
+        <w:t>}}</w:t>
+      </w:r>
+      <w:r>
+        <w:rPr>
+          <w:rFonts w:ascii="Raleway" w:eastAsia="Raleway" w:hAnsi="Raleway" w:cs="Raleway"/>
+          <w:b/>
+          <w:bCs/>
+          <w:sz w:val="24"/>
+          <w:szCs w:val="24"/>
+        </w:rPr>
+        <w:t xml:space="preserve">, </w:t>
+      </w:r>
+      <w:r>
+        <w:rPr>
+          <w:rFonts w:ascii="Raleway" w:eastAsia="Raleway" w:hAnsi="Raleway" w:cs="Raleway"/>
+          <w:b/>
+          <w:bCs/>
+          <w:sz w:val="24"/>
+          <w:szCs w:val="24"/>
+        </w:rPr>
+        <w:t>{{</w:t>
+      </w:r>
+      <w:r>
+        <w:rPr>
+          <w:rFonts w:ascii="Raleway" w:eastAsia="Raleway" w:hAnsi="Raleway" w:cs="Raleway"/>
+          <w:b/>
+          <w:bCs/>
+          <w:sz w:val="24"/>
+          <w:szCs w:val="24"/>
+        </w:rPr>
+        <w:t>N</w:t>
+      </w:r>
+      <w:r>
+        <w:rPr>
+          <w:rFonts w:ascii="Raleway" w:eastAsia="Raleway" w:hAnsi="Raleway" w:cs="Raleway"/>
+          <w:b/>
+          <w:bCs/>
+          <w:sz w:val="24"/>
+          <w:szCs w:val="24"/>
+        </w:rPr>
+        <w:t>u</w:t>
+      </w:r>
+      <w:r>
+        <w:rPr>
+          <w:rFonts w:ascii="Raleway" w:eastAsia="Raleway" w:hAnsi="Raleway" w:cs="Raleway"/>
+          <w:b/>
+          <w:bCs/>
+          <w:sz w:val="24"/>
+          <w:szCs w:val="24"/>
+        </w:rPr>
+        <w:t>mero</w:t>
+      </w:r>
+      <w:r>
+        <w:rPr>
+          <w:rFonts w:ascii="Raleway" w:eastAsia="Raleway" w:hAnsi="Raleway" w:cs="Raleway"/>
+          <w:b/>
+          <w:bCs/>
+          <w:sz w:val="24"/>
+          <w:szCs w:val="24"/>
+        </w:rPr>
+        <w:t>}}</w:t>
+      </w:r>
+      <w:r>
+        <w:rPr>
+          <w:rFonts w:ascii="Raleway" w:eastAsia="Raleway" w:hAnsi="Raleway" w:cs="Raleway"/>
+          <w:b/>
+          <w:bCs/>
+          <w:sz w:val="24"/>
+          <w:szCs w:val="24"/>
+        </w:rPr>
+        <w:t xml:space="preserve">, </w:t>
+      </w:r>
+      <w:r>
+        <w:rPr>
+          <w:rFonts w:ascii="Raleway" w:eastAsia="Raleway" w:hAnsi="Raleway" w:cs="Raleway"/>
+          <w:b/>
+          <w:bCs/>
+          <w:sz w:val="24"/>
+          <w:szCs w:val="24"/>
+        </w:rPr>
+        <w:t>{{</w:t>
+      </w:r>
+      <w:r>
+        <w:rPr>
+          <w:rFonts w:ascii="Raleway" w:eastAsia="Raleway" w:hAnsi="Raleway" w:cs="Raleway"/>
+          <w:b/>
+          <w:bCs/>
+          <w:sz w:val="24"/>
+          <w:szCs w:val="24"/>
+        </w:rPr>
+        <w:t>Complemento</w:t>
+      </w:r>
+      <w:r>
+        <w:rPr>
+          <w:rFonts w:ascii="Raleway" w:eastAsia="Raleway" w:hAnsi="Raleway" w:cs="Raleway"/>
+          <w:b/>
+          <w:bCs/>
+          <w:sz w:val="24"/>
+          <w:szCs w:val="24"/>
+        </w:rPr>
+        <w:t>}}</w:t>
+      </w:r>
+      <w:r>
+        <w:rPr>
+          <w:rFonts w:ascii="Raleway" w:eastAsia="Raleway" w:hAnsi="Raleway" w:cs="Raleway"/>
+          <w:b/>
+          <w:bCs/>
+          <w:sz w:val="24"/>
+          <w:szCs w:val="24"/>
+        </w:rPr>
+        <w:br/>
+      </w:r>
+      <w:r>
+        <w:rPr>
+          <w:rFonts w:ascii="Raleway" w:eastAsia="Raleway" w:hAnsi="Raleway" w:cs="Raleway"/>
+          <w:b/>
+          <w:bCs/>
+          <w:sz w:val="24"/>
+          <w:szCs w:val="24"/>
+        </w:rPr>
+        <w:t>{{</w:t>
+      </w:r>
+      <w:r>
+        <w:rPr>
+          <w:rFonts w:ascii="Raleway" w:eastAsia="Raleway" w:hAnsi="Raleway" w:cs="Raleway"/>
+          <w:b/>
+          <w:bCs/>
+          <w:sz w:val="24"/>
+          <w:szCs w:val="24"/>
+        </w:rPr>
+        <w:t>Bairro</w:t>
+      </w:r>
+      <w:r>
+        <w:rPr>
+          <w:rFonts w:ascii="Raleway" w:eastAsia="Raleway" w:hAnsi="Raleway" w:cs="Raleway"/>
+          <w:b/>
+          <w:bCs/>
+          <w:sz w:val="24"/>
+          <w:szCs w:val="24"/>
+        </w:rPr>
+        <w:t>}}</w:t>
+      </w:r>
+      <w:r>
+        <w:rPr>
+          <w:rFonts w:ascii="Raleway" w:eastAsia="Raleway" w:hAnsi="Raleway" w:cs="Raleway"/>
+          <w:b/>
+          <w:bCs/>
+          <w:sz w:val="24"/>
+          <w:szCs w:val="24"/>
+        </w:rPr>
+        <w:t xml:space="preserve">, </w:t>
+      </w:r>
+      <w:r>
+        <w:rPr>
+          <w:rFonts w:ascii="Raleway" w:eastAsia="Raleway" w:hAnsi="Raleway" w:cs="Raleway"/>
+          <w:b/>
+          <w:bCs/>
+          <w:sz w:val="24"/>
+          <w:szCs w:val="24"/>
+        </w:rPr>
+        <w:t>{{</w:t>
+      </w:r>
+      <w:r>
+        <w:rPr>
+          <w:rFonts w:ascii="Raleway" w:eastAsia="Raleway" w:hAnsi="Raleway" w:cs="Raleway"/>
+          <w:b/>
+          <w:bCs/>
+          <w:sz w:val="24"/>
+          <w:szCs w:val="24"/>
+        </w:rPr>
+        <w:t>Cidade</w:t>
+      </w:r>
+      <w:r>
+        <w:rPr>
+          <w:rFonts w:ascii="Raleway" w:eastAsia="Raleway" w:hAnsi="Raleway" w:cs="Raleway"/>
+          <w:b/>
+          <w:bCs/>
+          <w:sz w:val="24"/>
+          <w:szCs w:val="24"/>
+        </w:rPr>
+        <w:t>}}</w:t>
+      </w:r>
+      <w:r>
+        <w:rPr>
+          <w:rFonts w:ascii="Raleway" w:eastAsia="Raleway" w:hAnsi="Raleway" w:cs="Raleway"/>
+          <w:b/>
+          <w:bCs/>
+          <w:sz w:val="24"/>
+          <w:szCs w:val="24"/>
+        </w:rPr>
+        <w:t>-</w:t>
+      </w:r>
+      <w:r>
+        <w:rPr>
+          <w:rFonts w:ascii="Raleway" w:eastAsia="Raleway" w:hAnsi="Raleway" w:cs="Raleway"/>
+          <w:b/>
+          <w:bCs/>
+          <w:sz w:val="24"/>
+          <w:szCs w:val="24"/>
+        </w:rPr>
+        <w:t>{{</w:t>
+      </w:r>
+      <w:r>
+        <w:rPr>
+          <w:rFonts w:ascii="Raleway" w:eastAsia="Raleway" w:hAnsi="Raleway" w:cs="Raleway"/>
+          <w:b/>
+          <w:bCs/>
+          <w:sz w:val="24"/>
+          <w:szCs w:val="24"/>
+        </w:rPr>
+        <w:t>UF</w:t>
+      </w:r>
       <w:r>
         <w:rPr>
           <w:rFonts w:ascii="Raleway" w:eastAsia="Raleway" w:hAnsi="Raleway" w:cs="Raleway"/>
@@ -338,7 +556,89 @@
           <w:sz w:val="24"/>
           <w:szCs w:val="24"/>
         </w:rPr>
-        <w:t>cttcleinte</w:t>
+        <w:t>nome</w:t>
+      </w:r>
+      <w:r>
+        <w:rPr>
+          <w:rFonts w:ascii="Raleway" w:eastAsia="Raleway" w:hAnsi="Raleway" w:cs="Raleway"/>
+          <w:b/>
+          <w:bCs/>
+          <w:sz w:val="24"/>
+          <w:szCs w:val="24"/>
+        </w:rPr>
+        <w:t>cli</w:t>
+      </w:r>
+      <w:r>
+        <w:rPr>
+          <w:rFonts w:ascii="Raleway" w:eastAsia="Raleway" w:hAnsi="Raleway" w:cs="Raleway"/>
+          <w:b/>
+          <w:bCs/>
+          <w:sz w:val="24"/>
+          <w:szCs w:val="24"/>
+        </w:rPr>
+        <w:t>e</w:t>
+      </w:r>
+      <w:r>
+        <w:rPr>
+          <w:rFonts w:ascii="Raleway" w:eastAsia="Raleway" w:hAnsi="Raleway" w:cs="Raleway"/>
+          <w:b/>
+          <w:bCs/>
+          <w:sz w:val="24"/>
+          <w:szCs w:val="24"/>
+        </w:rPr>
+        <w:t>nte</w:t>
+      </w:r>
+      <w:proofErr w:type="spellEnd"/>
+      <w:r>
+        <w:rPr>
+          <w:rFonts w:ascii="Raleway" w:eastAsia="Raleway" w:hAnsi="Raleway" w:cs="Raleway"/>
+          <w:b/>
+          <w:bCs/>
+          <w:sz w:val="24"/>
+          <w:szCs w:val="24"/>
+        </w:rPr>
+        <w:t>}}</w:t>
+      </w:r>
+      <w:r>
+        <w:rPr>
+          <w:rFonts w:ascii="Raleway" w:eastAsia="Raleway" w:hAnsi="Raleway" w:cs="Raleway"/>
+          <w:b/>
+          <w:bCs/>
+          <w:sz w:val="24"/>
+          <w:szCs w:val="24"/>
+        </w:rPr>
+        <w:br/>
+      </w:r>
+      <w:r>
+        <w:rPr>
+          <w:rFonts w:ascii="Raleway" w:eastAsia="Raleway" w:hAnsi="Raleway" w:cs="Raleway"/>
+          <w:b/>
+          <w:bCs/>
+          <w:sz w:val="24"/>
+          <w:szCs w:val="24"/>
+        </w:rPr>
+        <w:t>{{</w:t>
+      </w:r>
+      <w:proofErr w:type="spellStart"/>
+      <w:r>
+        <w:rPr>
+          <w:rFonts w:ascii="Raleway" w:eastAsia="Raleway" w:hAnsi="Raleway" w:cs="Raleway"/>
+          <w:b/>
+          <w:bCs/>
+          <w:sz w:val="24"/>
+          <w:szCs w:val="24"/>
+        </w:rPr>
+        <w:t>tel</w:t>
+      </w:r>
+      <w:r>
+        <w:rPr>
+          <w:rFonts w:ascii="Raleway" w:eastAsia="Raleway" w:hAnsi="Raleway" w:cs="Raleway"/>
+          <w:b/>
+          <w:bCs/>
+          <w:sz w:val="24"/>
+          <w:szCs w:val="24"/>
+        </w:rPr>
+        <w:t>cliente</w:t>
       </w:r>
       <w:proofErr w:type="spellEnd"/>
       <w:r>

</xml_diff>

<commit_message>
Add 1 file, update 1 file
</commit_message>
<xml_diff>
--- a/public/Solicitação de vistoria.docx
+++ b/public/Solicitação de vistoria.docx
@@ -41,6 +41,8 @@
         <w:spacing w:before="240" w:after="240"/>
         <w:rPr>
           <w:rFonts w:ascii="Raleway" w:eastAsia="Raleway" w:hAnsi="Raleway" w:cs="Raleway"/>
+          <w:b/>
+          <w:bCs/>
           <w:sz w:val="24"/>
           <w:szCs w:val="24"/>
         </w:rPr>
@@ -54,56 +56,6 @@
           <w:szCs w:val="24"/>
         </w:rPr>
         <w:t>Vendedor(a) Responsável:</w:t>
-      </w:r>
-      <w:r>
-        <w:rPr>
-          <w:rFonts w:ascii="Raleway" w:eastAsia="Raleway" w:hAnsi="Raleway" w:cs="Raleway"/>
-          <w:b/>
-          <w:bCs/>
-          <w:sz w:val="24"/>
-          <w:szCs w:val="24"/>
-        </w:rPr>
-        <w:br/>
-      </w:r>
-      <w:r>
-        <w:rPr>
-          <w:rFonts w:ascii="Raleway" w:eastAsia="Raleway" w:hAnsi="Raleway" w:cs="Raleway"/>
-          <w:sz w:val="24"/>
-          <w:szCs w:val="24"/>
-        </w:rPr>
-        <w:t xml:space="preserve"> </w:t>
-      </w:r>
-      <w:r>
-        <w:rPr>
-          <w:rFonts w:ascii="Raleway" w:eastAsia="Raleway" w:hAnsi="Raleway" w:cs="Raleway"/>
-          <w:b/>
-          <w:bCs/>
-          <w:sz w:val="24"/>
-          <w:szCs w:val="24"/>
-        </w:rPr>
-        <w:t>{{</w:t>
-      </w:r>
-      <w:proofErr w:type="spellStart"/>
-      <w:r>
-        <w:rPr>
-          <w:rFonts w:ascii="Raleway" w:eastAsia="Raleway" w:hAnsi="Raleway" w:cs="Raleway"/>
-          <w:b/>
-          <w:bCs/>
-          <w:sz w:val="24"/>
-          <w:szCs w:val="24"/>
-        </w:rPr>
-        <w:t>nomevendedor</w:t>
-      </w:r>
-      <w:proofErr w:type="spellEnd"/>
-      <w:r>
-        <w:rPr>
-          <w:rFonts w:ascii="Raleway" w:eastAsia="Raleway" w:hAnsi="Raleway" w:cs="Raleway"/>
-          <w:b/>
-          <w:bCs/>
-          <w:sz w:val="24"/>
-          <w:szCs w:val="24"/>
-        </w:rPr>
-        <w:t>}}</w:t>
       </w:r>
     </w:p>
     <w:p>
@@ -118,22 +70,10 @@
       <w:r>
         <w:rPr>
           <w:rFonts w:ascii="Raleway" w:eastAsia="Raleway" w:hAnsi="Raleway" w:cs="Raleway"/>
-          <w:b/>
-          <w:bCs/>
-          <w:sz w:val="24"/>
-          <w:szCs w:val="24"/>
-        </w:rPr>
-        <w:t xml:space="preserve"> Empresa:</w:t>
-      </w:r>
-      <w:r>
-        <w:rPr>
-          <w:rFonts w:ascii="Raleway" w:eastAsia="Raleway" w:hAnsi="Raleway" w:cs="Raleway"/>
-          <w:b/>
-          <w:bCs/>
-          <w:sz w:val="24"/>
-          <w:szCs w:val="24"/>
-        </w:rPr>
-        <w:br/>
+          <w:sz w:val="24"/>
+          <w:szCs w:val="24"/>
+        </w:rPr>
+        <w:t xml:space="preserve"> </w:t>
       </w:r>
       <w:r>
         <w:rPr>
@@ -153,7 +93,7 @@
           <w:sz w:val="24"/>
           <w:szCs w:val="24"/>
         </w:rPr>
-        <w:t>empresa</w:t>
+        <w:t>nomevendedor</w:t>
       </w:r>
       <w:r>
         <w:rPr>
@@ -171,61 +111,21 @@
         <w:spacing w:before="240" w:after="240"/>
         <w:rPr>
           <w:rFonts w:ascii="Raleway" w:eastAsia="Raleway" w:hAnsi="Raleway" w:cs="Raleway"/>
-          <w:sz w:val="24"/>
-          <w:szCs w:val="24"/>
-        </w:rPr>
-      </w:pPr>
-      <w:r>
-        <w:rPr>
-          <w:rFonts w:ascii="Raleway" w:eastAsia="Raleway" w:hAnsi="Raleway" w:cs="Raleway"/>
-          <w:b/>
-          <w:bCs/>
-          <w:sz w:val="24"/>
-          <w:szCs w:val="24"/>
-        </w:rPr>
-        <w:t xml:space="preserve"> E-mail:</w:t>
-      </w:r>
-      <w:r>
-        <w:rPr>
-          <w:rFonts w:ascii="Raleway" w:eastAsia="Raleway" w:hAnsi="Raleway" w:cs="Raleway"/>
-          <w:b/>
-          <w:bCs/>
-          <w:sz w:val="24"/>
-          <w:szCs w:val="24"/>
-        </w:rPr>
-        <w:br/>
-      </w:r>
-      <w:r>
-        <w:rPr>
-          <w:rFonts w:ascii="Raleway" w:eastAsia="Raleway" w:hAnsi="Raleway" w:cs="Raleway"/>
-          <w:b/>
-          <w:bCs/>
-          <w:sz w:val="24"/>
-          <w:szCs w:val="24"/>
-        </w:rPr>
-        <w:t>{{</w:t>
-      </w:r>
-      <w:proofErr w:type="spellStart"/>
-      <w:r>
-        <w:rPr>
-          <w:rFonts w:ascii="Raleway" w:eastAsia="Raleway" w:hAnsi="Raleway" w:cs="Raleway"/>
-          <w:b/>
-          <w:bCs/>
-          <w:sz w:val="24"/>
-          <w:szCs w:val="24"/>
-        </w:rPr>
-        <w:t>emailcliente</w:t>
-      </w:r>
-      <w:proofErr w:type="spellEnd"/>
-      <w:r>
-        <w:rPr>
-          <w:rFonts w:ascii="Raleway" w:eastAsia="Raleway" w:hAnsi="Raleway" w:cs="Raleway"/>
-          <w:b/>
-          <w:bCs/>
-          <w:sz w:val="24"/>
-          <w:szCs w:val="24"/>
-        </w:rPr>
-        <w:t>}}</w:t>
+          <w:b/>
+          <w:bCs/>
+          <w:sz w:val="24"/>
+          <w:szCs w:val="24"/>
+        </w:rPr>
+      </w:pPr>
+      <w:r>
+        <w:rPr>
+          <w:rFonts w:ascii="Raleway" w:eastAsia="Raleway" w:hAnsi="Raleway" w:cs="Raleway"/>
+          <w:b/>
+          <w:bCs/>
+          <w:sz w:val="24"/>
+          <w:szCs w:val="24"/>
+        </w:rPr>
+        <w:t>Empresa:</w:t>
       </w:r>
     </w:p>
     <w:p>
@@ -245,7 +145,251 @@
           <w:sz w:val="24"/>
           <w:szCs w:val="24"/>
         </w:rPr>
-        <w:t xml:space="preserve"> Endereço:</w:t>
+        <w:t>{{</w:t>
+      </w:r>
+      <w:r>
+        <w:rPr>
+          <w:rFonts w:ascii="Raleway" w:eastAsia="Raleway" w:hAnsi="Raleway" w:cs="Raleway"/>
+          <w:b/>
+          <w:bCs/>
+          <w:sz w:val="24"/>
+          <w:szCs w:val="24"/>
+        </w:rPr>
+        <w:t>empresa</w:t>
+      </w:r>
+      <w:r>
+        <w:rPr>
+          <w:rFonts w:ascii="Raleway" w:eastAsia="Raleway" w:hAnsi="Raleway" w:cs="Raleway"/>
+          <w:b/>
+          <w:bCs/>
+          <w:sz w:val="24"/>
+          <w:szCs w:val="24"/>
+        </w:rPr>
+        <w:t>}}</w:t>
+      </w:r>
+    </w:p>
+    <w:p>
+      <w:pPr>
+        <w:spacing w:before="240" w:after="240"/>
+        <w:rPr>
+          <w:rFonts w:ascii="Raleway" w:eastAsia="Raleway" w:hAnsi="Raleway" w:cs="Raleway"/>
+          <w:b/>
+          <w:bCs/>
+          <w:sz w:val="24"/>
+          <w:szCs w:val="24"/>
+        </w:rPr>
+      </w:pPr>
+      <w:r>
+        <w:rPr>
+          <w:rFonts w:ascii="Raleway" w:eastAsia="Raleway" w:hAnsi="Raleway" w:cs="Raleway"/>
+          <w:b/>
+          <w:bCs/>
+          <w:sz w:val="24"/>
+          <w:szCs w:val="24"/>
+        </w:rPr>
+        <w:t>E-mail:</w:t>
+      </w:r>
+    </w:p>
+    <w:p>
+      <w:pPr>
+        <w:spacing w:before="240" w:after="240"/>
+        <w:rPr>
+          <w:rFonts w:ascii="Raleway" w:eastAsia="Raleway" w:hAnsi="Raleway" w:cs="Raleway"/>
+          <w:sz w:val="24"/>
+          <w:szCs w:val="24"/>
+        </w:rPr>
+      </w:pPr>
+      <w:r>
+        <w:rPr>
+          <w:rFonts w:ascii="Raleway" w:eastAsia="Raleway" w:hAnsi="Raleway" w:cs="Raleway"/>
+          <w:b/>
+          <w:bCs/>
+          <w:sz w:val="24"/>
+          <w:szCs w:val="24"/>
+        </w:rPr>
+        <w:t>{{</w:t>
+      </w:r>
+      <w:r>
+        <w:rPr>
+          <w:rFonts w:ascii="Raleway" w:eastAsia="Raleway" w:hAnsi="Raleway" w:cs="Raleway"/>
+          <w:b/>
+          <w:bCs/>
+          <w:sz w:val="24"/>
+          <w:szCs w:val="24"/>
+        </w:rPr>
+        <w:t>emailcliente</w:t>
+      </w:r>
+      <w:r>
+        <w:rPr>
+          <w:rFonts w:ascii="Raleway" w:eastAsia="Raleway" w:hAnsi="Raleway" w:cs="Raleway"/>
+          <w:b/>
+          <w:bCs/>
+          <w:sz w:val="24"/>
+          <w:szCs w:val="24"/>
+        </w:rPr>
+        <w:t>}}</w:t>
+      </w:r>
+    </w:p>
+    <w:p>
+      <w:pPr>
+        <w:spacing w:before="240" w:after="240"/>
+        <w:rPr>
+          <w:rFonts w:ascii="Raleway" w:eastAsia="Raleway" w:hAnsi="Raleway" w:cs="Raleway"/>
+          <w:b/>
+          <w:bCs/>
+          <w:sz w:val="24"/>
+          <w:szCs w:val="24"/>
+        </w:rPr>
+      </w:pPr>
+      <w:r>
+        <w:rPr>
+          <w:rFonts w:ascii="Raleway" w:eastAsia="Raleway" w:hAnsi="Raleway" w:cs="Raleway"/>
+          <w:b/>
+          <w:bCs/>
+          <w:sz w:val="24"/>
+          <w:szCs w:val="24"/>
+        </w:rPr>
+        <w:t>Endereço:</w:t>
+      </w:r>
+    </w:p>
+    <w:p>
+      <w:pPr>
+        <w:spacing w:before="240" w:after="240"/>
+        <w:rPr>
+          <w:rFonts w:ascii="Raleway" w:eastAsia="Raleway" w:hAnsi="Raleway" w:cs="Raleway"/>
+          <w:sz w:val="24"/>
+          <w:szCs w:val="24"/>
+        </w:rPr>
+      </w:pPr>
+      <w:r>
+        <w:rPr>
+          <w:rFonts w:ascii="Raleway" w:eastAsia="Raleway" w:hAnsi="Raleway" w:cs="Raleway"/>
+          <w:b/>
+          <w:bCs/>
+          <w:sz w:val="24"/>
+          <w:szCs w:val="24"/>
+        </w:rPr>
+        <w:t>{{</w:t>
+      </w:r>
+      <w:r>
+        <w:rPr>
+          <w:rFonts w:ascii="Raleway" w:eastAsia="Raleway" w:hAnsi="Raleway" w:cs="Raleway"/>
+          <w:b/>
+          <w:bCs/>
+          <w:sz w:val="24"/>
+          <w:szCs w:val="24"/>
+        </w:rPr>
+        <w:t>Rua</w:t>
+      </w:r>
+      <w:r>
+        <w:rPr>
+          <w:rFonts w:ascii="Raleway" w:eastAsia="Raleway" w:hAnsi="Raleway" w:cs="Raleway"/>
+          <w:b/>
+          <w:bCs/>
+          <w:sz w:val="24"/>
+          <w:szCs w:val="24"/>
+        </w:rPr>
+        <w:t>}}</w:t>
+      </w:r>
+      <w:r>
+        <w:rPr>
+          <w:rFonts w:ascii="Raleway" w:eastAsia="Raleway" w:hAnsi="Raleway" w:cs="Raleway"/>
+          <w:b/>
+          <w:bCs/>
+          <w:sz w:val="24"/>
+          <w:szCs w:val="24"/>
+        </w:rPr>
+        <w:t xml:space="preserve">, </w:t>
+      </w:r>
+      <w:r>
+        <w:rPr>
+          <w:rFonts w:ascii="Raleway" w:eastAsia="Raleway" w:hAnsi="Raleway" w:cs="Raleway"/>
+          <w:b/>
+          <w:bCs/>
+          <w:sz w:val="24"/>
+          <w:szCs w:val="24"/>
+        </w:rPr>
+        <w:t>{{</w:t>
+      </w:r>
+      <w:r>
+        <w:rPr>
+          <w:rFonts w:ascii="Raleway" w:eastAsia="Raleway" w:hAnsi="Raleway" w:cs="Raleway"/>
+          <w:b/>
+          <w:bCs/>
+          <w:sz w:val="24"/>
+          <w:szCs w:val="24"/>
+        </w:rPr>
+        <w:t>N</w:t>
+      </w:r>
+      <w:r>
+        <w:rPr>
+          <w:rFonts w:ascii="Raleway" w:eastAsia="Raleway" w:hAnsi="Raleway" w:cs="Raleway"/>
+          <w:b/>
+          <w:bCs/>
+          <w:sz w:val="24"/>
+          <w:szCs w:val="24"/>
+        </w:rPr>
+        <w:t>u</w:t>
+      </w:r>
+      <w:r>
+        <w:rPr>
+          <w:rFonts w:ascii="Raleway" w:eastAsia="Raleway" w:hAnsi="Raleway" w:cs="Raleway"/>
+          <w:b/>
+          <w:bCs/>
+          <w:sz w:val="24"/>
+          <w:szCs w:val="24"/>
+        </w:rPr>
+        <w:t>mero</w:t>
+      </w:r>
+      <w:r>
+        <w:rPr>
+          <w:rFonts w:ascii="Raleway" w:eastAsia="Raleway" w:hAnsi="Raleway" w:cs="Raleway"/>
+          <w:b/>
+          <w:bCs/>
+          <w:sz w:val="24"/>
+          <w:szCs w:val="24"/>
+        </w:rPr>
+        <w:t>}}</w:t>
+      </w:r>
+      <w:r>
+        <w:rPr>
+          <w:rFonts w:ascii="Raleway" w:eastAsia="Raleway" w:hAnsi="Raleway" w:cs="Raleway"/>
+          <w:b/>
+          <w:bCs/>
+          <w:sz w:val="24"/>
+          <w:szCs w:val="24"/>
+        </w:rPr>
+        <w:t xml:space="preserve">, </w:t>
+      </w:r>
+      <w:r>
+        <w:rPr>
+          <w:rFonts w:ascii="Raleway" w:eastAsia="Raleway" w:hAnsi="Raleway" w:cs="Raleway"/>
+          <w:b/>
+          <w:bCs/>
+          <w:sz w:val="24"/>
+          <w:szCs w:val="24"/>
+        </w:rPr>
+        <w:t>{{</w:t>
+      </w:r>
+      <w:r>
+        <w:rPr>
+          <w:rFonts w:ascii="Raleway" w:eastAsia="Raleway" w:hAnsi="Raleway" w:cs="Raleway"/>
+          <w:b/>
+          <w:bCs/>
+          <w:sz w:val="24"/>
+          <w:szCs w:val="24"/>
+        </w:rPr>
+        <w:t>Complemento</w:t>
+      </w:r>
+      <w:r>
+        <w:rPr>
+          <w:rFonts w:ascii="Raleway" w:eastAsia="Raleway" w:hAnsi="Raleway" w:cs="Raleway"/>
+          <w:b/>
+          <w:bCs/>
+          <w:sz w:val="24"/>
+          <w:szCs w:val="24"/>
+        </w:rPr>
+        <w:t>}}</w:t>
       </w:r>
       <w:r>
         <w:rPr>
@@ -275,7 +419,7 @@
           <w:sz w:val="24"/>
           <w:szCs w:val="24"/>
         </w:rPr>
-        <w:t>Rua</w:t>
+        <w:t>Bairro</w:t>
       </w:r>
       <w:r>
         <w:rPr>
@@ -315,27 +459,7 @@
           <w:sz w:val="24"/>
           <w:szCs w:val="24"/>
         </w:rPr>
-        <w:t>N</w:t>
-      </w:r>
-      <w:r>
-        <w:rPr>
-          <w:rFonts w:ascii="Raleway" w:eastAsia="Raleway" w:hAnsi="Raleway" w:cs="Raleway"/>
-          <w:b/>
-          <w:bCs/>
-          <w:sz w:val="24"/>
-          <w:szCs w:val="24"/>
-        </w:rPr>
-        <w:t>u</w:t>
-      </w:r>
-      <w:r>
-        <w:rPr>
-          <w:rFonts w:ascii="Raleway" w:eastAsia="Raleway" w:hAnsi="Raleway" w:cs="Raleway"/>
-          <w:b/>
-          <w:bCs/>
-          <w:sz w:val="24"/>
-          <w:szCs w:val="24"/>
-        </w:rPr>
-        <w:t>mero</w:t>
+        <w:t>Cidade</w:t>
       </w:r>
       <w:r>
         <w:rPr>
@@ -355,7 +479,7 @@
           <w:sz w:val="24"/>
           <w:szCs w:val="24"/>
         </w:rPr>
-        <w:t xml:space="preserve">, </w:t>
+        <w:t>-</w:t>
       </w:r>
       <w:r>
         <w:rPr>
@@ -375,7 +499,7 @@
           <w:sz w:val="24"/>
           <w:szCs w:val="24"/>
         </w:rPr>
-        <w:t>Complemento</w:t>
+        <w:t>UF</w:t>
       </w:r>
       <w:r>
         <w:rPr>
@@ -387,6 +511,100 @@
         </w:rPr>
         <w:t>}}</w:t>
       </w:r>
+    </w:p>
+    <w:p>
+      <w:pPr>
+        <w:spacing w:before="240" w:after="240"/>
+        <w:rPr>
+          <w:rFonts w:ascii="Raleway" w:eastAsia="Raleway" w:hAnsi="Raleway" w:cs="Raleway"/>
+          <w:b/>
+          <w:bCs/>
+          <w:sz w:val="24"/>
+          <w:szCs w:val="24"/>
+        </w:rPr>
+      </w:pPr>
+      <w:r>
+        <w:rPr>
+          <w:rFonts w:ascii="Raleway" w:eastAsia="Raleway" w:hAnsi="Raleway" w:cs="Raleway"/>
+          <w:b/>
+          <w:bCs/>
+          <w:sz w:val="24"/>
+          <w:szCs w:val="24"/>
+        </w:rPr>
+        <w:t>Contato responsável:</w:t>
+      </w:r>
+    </w:p>
+    <w:p>
+      <w:pPr>
+        <w:spacing w:before="240" w:after="240"/>
+        <w:rPr>
+          <w:rFonts w:ascii="Raleway" w:eastAsia="Raleway" w:hAnsi="Raleway" w:cs="Raleway"/>
+          <w:b/>
+          <w:bCs/>
+          <w:sz w:val="24"/>
+          <w:szCs w:val="24"/>
+        </w:rPr>
+      </w:pPr>
+      <w:r>
+        <w:rPr>
+          <w:rFonts w:ascii="Raleway" w:eastAsia="Raleway" w:hAnsi="Raleway" w:cs="Raleway"/>
+          <w:b/>
+          <w:bCs/>
+          <w:sz w:val="24"/>
+          <w:szCs w:val="24"/>
+        </w:rPr>
+        <w:t>{{</w:t>
+      </w:r>
+      <w:r>
+        <w:rPr>
+          <w:rFonts w:ascii="Raleway" w:eastAsia="Raleway" w:hAnsi="Raleway" w:cs="Raleway"/>
+          <w:b/>
+          <w:bCs/>
+          <w:sz w:val="24"/>
+          <w:szCs w:val="24"/>
+        </w:rPr>
+        <w:t>nome</w:t>
+      </w:r>
+      <w:r>
+        <w:rPr>
+          <w:rFonts w:ascii="Raleway" w:eastAsia="Raleway" w:hAnsi="Raleway" w:cs="Raleway"/>
+          <w:b/>
+          <w:bCs/>
+          <w:sz w:val="24"/>
+          <w:szCs w:val="24"/>
+        </w:rPr>
+        <w:t>cli</w:t>
+      </w:r>
+      <w:r>
+        <w:rPr>
+          <w:rFonts w:ascii="Raleway" w:eastAsia="Raleway" w:hAnsi="Raleway" w:cs="Raleway"/>
+          <w:b/>
+          <w:bCs/>
+          <w:sz w:val="24"/>
+          <w:szCs w:val="24"/>
+        </w:rPr>
+        <w:t>e</w:t>
+      </w:r>
+      <w:r>
+        <w:rPr>
+          <w:rFonts w:ascii="Raleway" w:eastAsia="Raleway" w:hAnsi="Raleway" w:cs="Raleway"/>
+          <w:b/>
+          <w:bCs/>
+          <w:sz w:val="24"/>
+          <w:szCs w:val="24"/>
+        </w:rPr>
+        <w:t>nte</w:t>
+      </w:r>
+      <w:r>
+        <w:rPr>
+          <w:rFonts w:ascii="Raleway" w:eastAsia="Raleway" w:hAnsi="Raleway" w:cs="Raleway"/>
+          <w:b/>
+          <w:bCs/>
+          <w:sz w:val="24"/>
+          <w:szCs w:val="24"/>
+        </w:rPr>
+        <w:t>}}</w:t>
+      </w:r>
       <w:r>
         <w:rPr>
           <w:rFonts w:ascii="Raleway" w:eastAsia="Raleway" w:hAnsi="Raleway" w:cs="Raleway"/>
@@ -415,87 +633,7 @@
           <w:sz w:val="24"/>
           <w:szCs w:val="24"/>
         </w:rPr>
-        <w:t>Bairro</w:t>
-      </w:r>
-      <w:r>
-        <w:rPr>
-          <w:rFonts w:ascii="Raleway" w:eastAsia="Raleway" w:hAnsi="Raleway" w:cs="Raleway"/>
-          <w:b/>
-          <w:bCs/>
-          <w:sz w:val="24"/>
-          <w:szCs w:val="24"/>
-        </w:rPr>
-        <w:t>}}</w:t>
-      </w:r>
-      <w:r>
-        <w:rPr>
-          <w:rFonts w:ascii="Raleway" w:eastAsia="Raleway" w:hAnsi="Raleway" w:cs="Raleway"/>
-          <w:b/>
-          <w:bCs/>
-          <w:sz w:val="24"/>
-          <w:szCs w:val="24"/>
-        </w:rPr>
-        <w:t xml:space="preserve">, </w:t>
-      </w:r>
-      <w:r>
-        <w:rPr>
-          <w:rFonts w:ascii="Raleway" w:eastAsia="Raleway" w:hAnsi="Raleway" w:cs="Raleway"/>
-          <w:b/>
-          <w:bCs/>
-          <w:sz w:val="24"/>
-          <w:szCs w:val="24"/>
-        </w:rPr>
-        <w:t>{{</w:t>
-      </w:r>
-      <w:r>
-        <w:rPr>
-          <w:rFonts w:ascii="Raleway" w:eastAsia="Raleway" w:hAnsi="Raleway" w:cs="Raleway"/>
-          <w:b/>
-          <w:bCs/>
-          <w:sz w:val="24"/>
-          <w:szCs w:val="24"/>
-        </w:rPr>
-        <w:t>Cidade</w:t>
-      </w:r>
-      <w:r>
-        <w:rPr>
-          <w:rFonts w:ascii="Raleway" w:eastAsia="Raleway" w:hAnsi="Raleway" w:cs="Raleway"/>
-          <w:b/>
-          <w:bCs/>
-          <w:sz w:val="24"/>
-          <w:szCs w:val="24"/>
-        </w:rPr>
-        <w:t>}}</w:t>
-      </w:r>
-      <w:r>
-        <w:rPr>
-          <w:rFonts w:ascii="Raleway" w:eastAsia="Raleway" w:hAnsi="Raleway" w:cs="Raleway"/>
-          <w:b/>
-          <w:bCs/>
-          <w:sz w:val="24"/>
-          <w:szCs w:val="24"/>
-        </w:rPr>
-        <w:t>-</w:t>
-      </w:r>
-      <w:r>
-        <w:rPr>
-          <w:rFonts w:ascii="Raleway" w:eastAsia="Raleway" w:hAnsi="Raleway" w:cs="Raleway"/>
-          <w:b/>
-          <w:bCs/>
-          <w:sz w:val="24"/>
-          <w:szCs w:val="24"/>
-        </w:rPr>
-        <w:t>{{</w:t>
-      </w:r>
-      <w:r>
-        <w:rPr>
-          <w:rFonts w:ascii="Raleway" w:eastAsia="Raleway" w:hAnsi="Raleway" w:cs="Raleway"/>
-          <w:b/>
-          <w:bCs/>
-          <w:sz w:val="24"/>
-          <w:szCs w:val="24"/>
-        </w:rPr>
-        <w:t>UF</w:t>
+        <w:t>telcliente</w:t>
       </w:r>
       <w:r>
         <w:rPr>
@@ -517,157 +655,6 @@
           <w:szCs w:val="25"/>
         </w:rPr>
       </w:pPr>
-      <w:r>
-        <w:rPr>
-          <w:rFonts w:ascii="Raleway" w:eastAsia="Raleway" w:hAnsi="Raleway" w:cs="Raleway"/>
-          <w:b/>
-          <w:bCs/>
-          <w:sz w:val="24"/>
-          <w:szCs w:val="24"/>
-        </w:rPr>
-        <w:t>Contato responsável:</w:t>
-      </w:r>
-      <w:r>
-        <w:rPr>
-          <w:rFonts w:ascii="Raleway" w:eastAsia="Raleway" w:hAnsi="Raleway" w:cs="Raleway"/>
-          <w:b/>
-          <w:bCs/>
-          <w:sz w:val="24"/>
-          <w:szCs w:val="24"/>
-        </w:rPr>
-        <w:br/>
-      </w:r>
-      <w:r>
-        <w:rPr>
-          <w:rFonts w:ascii="Raleway" w:eastAsia="Raleway" w:hAnsi="Raleway" w:cs="Raleway"/>
-          <w:b/>
-          <w:bCs/>
-          <w:sz w:val="24"/>
-          <w:szCs w:val="24"/>
-        </w:rPr>
-        <w:t>{{</w:t>
-      </w:r>
-      <w:proofErr w:type="spellStart"/>
-      <w:r>
-        <w:rPr>
-          <w:rFonts w:ascii="Raleway" w:eastAsia="Raleway" w:hAnsi="Raleway" w:cs="Raleway"/>
-          <w:b/>
-          <w:bCs/>
-          <w:sz w:val="24"/>
-          <w:szCs w:val="24"/>
-        </w:rPr>
-        <w:t>nome</w:t>
-      </w:r>
-      <w:r>
-        <w:rPr>
-          <w:rFonts w:ascii="Raleway" w:eastAsia="Raleway" w:hAnsi="Raleway" w:cs="Raleway"/>
-          <w:b/>
-          <w:bCs/>
-          <w:sz w:val="24"/>
-          <w:szCs w:val="24"/>
-        </w:rPr>
-        <w:t>cli</w:t>
-      </w:r>
-      <w:r>
-        <w:rPr>
-          <w:rFonts w:ascii="Raleway" w:eastAsia="Raleway" w:hAnsi="Raleway" w:cs="Raleway"/>
-          <w:b/>
-          <w:bCs/>
-          <w:sz w:val="24"/>
-          <w:szCs w:val="24"/>
-        </w:rPr>
-        <w:t>e</w:t>
-      </w:r>
-      <w:r>
-        <w:rPr>
-          <w:rFonts w:ascii="Raleway" w:eastAsia="Raleway" w:hAnsi="Raleway" w:cs="Raleway"/>
-          <w:b/>
-          <w:bCs/>
-          <w:sz w:val="24"/>
-          <w:szCs w:val="24"/>
-        </w:rPr>
-        <w:t>nte</w:t>
-      </w:r>
-      <w:proofErr w:type="spellEnd"/>
-      <w:r>
-        <w:rPr>
-          <w:rFonts w:ascii="Raleway" w:eastAsia="Raleway" w:hAnsi="Raleway" w:cs="Raleway"/>
-          <w:b/>
-          <w:bCs/>
-          <w:sz w:val="24"/>
-          <w:szCs w:val="24"/>
-        </w:rPr>
-        <w:t>}}</w:t>
-      </w:r>
-      <w:r>
-        <w:rPr>
-          <w:rFonts w:ascii="Raleway" w:eastAsia="Raleway" w:hAnsi="Raleway" w:cs="Raleway"/>
-          <w:b/>
-          <w:bCs/>
-          <w:sz w:val="24"/>
-          <w:szCs w:val="24"/>
-        </w:rPr>
-        <w:br/>
-      </w:r>
-      <w:r>
-        <w:rPr>
-          <w:rFonts w:ascii="Raleway" w:eastAsia="Raleway" w:hAnsi="Raleway" w:cs="Raleway"/>
-          <w:b/>
-          <w:bCs/>
-          <w:sz w:val="24"/>
-          <w:szCs w:val="24"/>
-        </w:rPr>
-        <w:t>{{</w:t>
-      </w:r>
-      <w:proofErr w:type="spellStart"/>
-      <w:r>
-        <w:rPr>
-          <w:rFonts w:ascii="Raleway" w:eastAsia="Raleway" w:hAnsi="Raleway" w:cs="Raleway"/>
-          <w:b/>
-          <w:bCs/>
-          <w:sz w:val="24"/>
-          <w:szCs w:val="24"/>
-        </w:rPr>
-        <w:t>tel</w:t>
-      </w:r>
-      <w:r>
-        <w:rPr>
-          <w:rFonts w:ascii="Raleway" w:eastAsia="Raleway" w:hAnsi="Raleway" w:cs="Raleway"/>
-          <w:b/>
-          <w:bCs/>
-          <w:sz w:val="24"/>
-          <w:szCs w:val="24"/>
-        </w:rPr>
-        <w:t>cliente</w:t>
-      </w:r>
-      <w:proofErr w:type="spellEnd"/>
-      <w:r>
-        <w:rPr>
-          <w:rFonts w:ascii="Raleway" w:eastAsia="Raleway" w:hAnsi="Raleway" w:cs="Raleway"/>
-          <w:b/>
-          <w:bCs/>
-          <w:sz w:val="24"/>
-          <w:szCs w:val="24"/>
-        </w:rPr>
-        <w:t>}}</w:t>
-      </w:r>
-      <w:r>
-        <w:rPr>
-          <w:rFonts w:ascii="Raleway" w:eastAsia="Raleway" w:hAnsi="Raleway" w:cs="Raleway"/>
-          <w:sz w:val="24"/>
-          <w:szCs w:val="24"/>
-        </w:rPr>
-        <w:br/>
-      </w:r>
-      <w:r>
-        <w:rPr>
-          <w:rFonts w:ascii="Raleway" w:eastAsia="Raleway" w:hAnsi="Raleway" w:cs="Raleway"/>
-          <w:sz w:val="24"/>
-          <w:szCs w:val="24"/>
-        </w:rPr>
-        <w:br/>
-        <w:t xml:space="preserve"> </w:t>
-      </w:r>
       <w:r>
         <w:rPr>
           <w:rFonts w:ascii="Avenir" w:eastAsia="Avenir" w:hAnsi="Avenir" w:cs="Avenir"/>
@@ -894,7 +881,6 @@
               </w:rPr>
               <w:t>{{</w:t>
             </w:r>
-            <w:proofErr w:type="spellStart"/>
             <w:r>
               <w:rPr>
                 <w:rFonts w:ascii="Avenir" w:eastAsia="Avenir" w:hAnsi="Avenir" w:cs="Avenir"/>
@@ -907,7 +893,6 @@
               </w:rPr>
               <w:t>qtd</w:t>
             </w:r>
-            <w:proofErr w:type="spellEnd"/>
             <w:r>
               <w:rPr>
                 <w:rFonts w:ascii="Avenir" w:eastAsia="Avenir" w:hAnsi="Avenir" w:cs="Avenir"/>
@@ -1006,7 +991,6 @@
         </w:rPr>
         <w:t>{{</w:t>
       </w:r>
-      <w:proofErr w:type="spellStart"/>
       <w:r>
         <w:rPr>
           <w:rFonts w:ascii="Avenir" w:eastAsia="Avenir" w:hAnsi="Avenir" w:cs="Avenir"/>
@@ -1019,7 +1003,6 @@
         </w:rPr>
         <w:t>obs</w:t>
       </w:r>
-      <w:proofErr w:type="spellEnd"/>
       <w:r>
         <w:rPr>
           <w:rFonts w:ascii="Avenir" w:eastAsia="Avenir" w:hAnsi="Avenir" w:cs="Avenir"/>
@@ -1839,6 +1822,7 @@
   <w:style w:type="character" w:default="1" w:styleId="Fontepargpadro">
     <w:name w:val="Default Paragraph Font"/>
     <w:uiPriority w:val="1"/>
+    <w:semiHidden/>
     <w:unhideWhenUsed/>
   </w:style>
   <w:style w:type="table" w:default="1" w:styleId="Tabelanormal">

</xml_diff>